<commit_message>
fix(sorular): deneme 2'de Karar dayanaklı 4 sorunun kökünü düzelt
71, 73, 74 ve 86. sorular '4458 sayılı ...' ile başlayıp Kanun izlenimi veriyordu;
kurum kalıbına göre '2009/15481 sayılı "4458 sayılı Gümrük Kanununun Bazı
Maddelerinin Uygulanması Hakkında Karar"a göre' biçimine çevrildi. Kural CLAUDE.md'ye eklendi.

Co-Authored-By: Claude Opus 5.5 <noreply@anthropic.com>
Claude-Session: https://claude.ai/code/session_01QTaYRAfcqhZcxQenMBqPDx
</commit_message>
<xml_diff>
--- a/sorular/GK_GMY_Deneme2_100soru.docx
+++ b/sorular/GK_GMY_Deneme2_100soru.docx
@@ -6961,7 +6961,7 @@
         <w:t xml:space="preserve">71- </w:t>
       </w:r>
       <w:r>
-        <w:t xml:space="preserve">4458 sayılı Gümrük Kanunu'nun Bazı Maddelerinin Uygulanması Hakkında Karar'a göre Türk bayrağı çekilmiş gemilerin Türkiye Gümrük Bölgesine getirilmeksizin serbest dolaşıma girişinde, geminin Türk Uluslararası Gemi Siciline veya Milli Gemi Siciline kaydedilmesi için Bayrak Şahadetnamesinin düzenlendiği tarihten itibaren en geç ne kadar süre içinde mahalli sicile başvurulması gerekir?</w:t>
+        <w:t xml:space="preserve">2009/15481 sayılı “4458 sayılı Gümrük Kanununun Bazı Maddelerinin Uygulanması Hakkında Karar”a göre Türk bayrağı çekilmiş gemilerin Türkiye Gümrük Bölgesine getirilmeksizin serbest dolaşıma girişinde, geminin Türk Uluslararası Gemi Siciline veya Milli Gemi Siciline kaydedilmesi için Bayrak Şahadetnamesinin düzenlendiği tarihten itibaren en geç ne kadar süre içinde mahalli sicile başvurulması gerekir?</w:t>
       </w:r>
     </w:p>
     <w:p>
@@ -7173,7 +7173,7 @@
         <w:t xml:space="preserve">73- </w:t>
       </w:r>
       <w:r>
-        <w:t xml:space="preserve">4458 sayılı Gümrük Kanunu'nun Bazı Maddelerinin Uygulanması Hakkında Karar'a göre, yerleşim yerini Türkiye Gümrük Bölgesine nakleden gerçek kişilere ait kullanılmış motorlu özel nakil vasıtası muafiyetinden aşağıdaki kişilerden hangisi yararlanabilir?</w:t>
+        <w:t xml:space="preserve">2009/15481 sayılı “4458 sayılı Gümrük Kanununun Bazı Maddelerinin Uygulanması Hakkında Karar”a göre, yerleşim yerini Türkiye Gümrük Bölgesine nakleden gerçek kişilere ait kullanılmış motorlu özel nakil vasıtası muafiyetinden aşağıdaki kişilerden hangisi yararlanabilir?</w:t>
       </w:r>
     </w:p>
     <w:p>
@@ -7254,7 +7254,7 @@
         <w:t xml:space="preserve">74- </w:t>
       </w:r>
       <w:r>
-        <w:t xml:space="preserve">4458 sayılı Gümrük Kanunu'nun Bazı Maddelerinin Uygulanması Hakkında Karar'a göre kişisel eşya ve yolcu beraberi eşya muafiyetine ilişkin aşağıdaki ifadelerden hangisi yanlıştır?</w:t>
+        <w:t xml:space="preserve">2009/15481 sayılı “4458 sayılı Gümrük Kanununun Bazı Maddelerinin Uygulanması Hakkında Karar”a göre kişisel eşya ve yolcu beraberi eşya muafiyetine ilişkin aşağıdaki ifadelerden hangisi yanlıştır?</w:t>
       </w:r>
     </w:p>
     <w:p>
@@ -8326,7 +8326,7 @@
         <w:t xml:space="preserve">86- </w:t>
       </w:r>
       <w:r>
-        <w:t xml:space="preserve">4458 sayılı Gümrük Kanununun Bazı Maddelerinin Uygulanması Hakkında Karar'ın geçici ithalat rejimine ilişkin hükümleri ile ilgili olarak;</w:t>
+        <w:t xml:space="preserve">2009/15481 sayılı “4458 sayılı Gümrük Kanununun Bazı Maddelerinin Uygulanması Hakkında Karar”ın geçici ithalat rejimine ilişkin hükümleri ile ilgili olarak;</w:t>
       </w:r>
     </w:p>
     <w:p>
@@ -25031,7 +25031,7 @@
         <w:t xml:space="preserve">71- </w:t>
       </w:r>
       <w:r>
-        <w:t xml:space="preserve">4458 sayılı Gümrük Kanunu'nun Bazı Maddelerinin Uygulanması Hakkında Karar'a göre Türk bayrağı çekilmiş gemilerin Türkiye Gümrük Bölgesine getirilmeksizin serbest dolaşıma girişinde, geminin Türk Uluslararası Gemi Siciline veya Milli Gemi Siciline kaydedilmesi için Bayrak Şahadetnamesinin düzenlendiği tarihten itibaren en geç ne kadar süre içinde mahalli sicile başvurulması gerekir?</w:t>
+        <w:t xml:space="preserve">2009/15481 sayılı “4458 sayılı Gümrük Kanununun Bazı Maddelerinin Uygulanması Hakkında Karar”a göre Türk bayrağı çekilmiş gemilerin Türkiye Gümrük Bölgesine getirilmeksizin serbest dolaşıma girişinde, geminin Türk Uluslararası Gemi Siciline veya Milli Gemi Siciline kaydedilmesi için Bayrak Şahadetnamesinin düzenlendiği tarihten itibaren en geç ne kadar süre içinde mahalli sicile başvurulması gerekir?</w:t>
       </w:r>
     </w:p>
     <w:p>
@@ -25347,7 +25347,7 @@
         <w:t xml:space="preserve">73- </w:t>
       </w:r>
       <w:r>
-        <w:t xml:space="preserve">4458 sayılı Gümrük Kanunu'nun Bazı Maddelerinin Uygulanması Hakkında Karar'a göre, yerleşim yerini Türkiye Gümrük Bölgesine nakleden gerçek kişilere ait kullanılmış motorlu özel nakil vasıtası muafiyetinden aşağıdaki kişilerden hangisi yararlanabilir?</w:t>
+        <w:t xml:space="preserve">2009/15481 sayılı “4458 sayılı Gümrük Kanununun Bazı Maddelerinin Uygulanması Hakkında Karar”a göre, yerleşim yerini Türkiye Gümrük Bölgesine nakleden gerçek kişilere ait kullanılmış motorlu özel nakil vasıtası muafiyetinden aşağıdaki kişilerden hangisi yararlanabilir?</w:t>
       </w:r>
     </w:p>
     <w:p>
@@ -25480,7 +25480,7 @@
         <w:t xml:space="preserve">74- </w:t>
       </w:r>
       <w:r>
-        <w:t xml:space="preserve">4458 sayılı Gümrük Kanunu'nun Bazı Maddelerinin Uygulanması Hakkında Karar'a göre kişisel eşya ve yolcu beraberi eşya muafiyetine ilişkin aşağıdaki ifadelerden hangisi yanlıştır?</w:t>
+        <w:t xml:space="preserve">2009/15481 sayılı “4458 sayılı Gümrük Kanununun Bazı Maddelerinin Uygulanması Hakkında Karar”a göre kişisel eşya ve yolcu beraberi eşya muafiyetine ilişkin aşağıdaki ifadelerden hangisi yanlıştır?</w:t>
       </w:r>
     </w:p>
     <w:p>
@@ -27176,7 +27176,7 @@
         <w:t xml:space="preserve">86- </w:t>
       </w:r>
       <w:r>
-        <w:t xml:space="preserve">4458 sayılı Gümrük Kanununun Bazı Maddelerinin Uygulanması Hakkında Karar'ın geçici ithalat rejimine ilişkin hükümleri ile ilgili olarak;</w:t>
+        <w:t xml:space="preserve">2009/15481 sayılı “4458 sayılı Gümrük Kanununun Bazı Maddelerinin Uygulanması Hakkında Karar”ın geçici ithalat rejimine ilişkin hükümleri ile ilgili olarak;</w:t>
       </w:r>
     </w:p>
     <w:p>

</xml_diff>